<commit_message>
Update platform URL to pro-palenke-vw-two.vercel.app.
Keep docs, final formats, and generate scripts pointing at the current validation deployment.

Co-authored-by: Cursor <cursoragent@cursor.com>
</commit_message>
<xml_diff>
--- a/docs/final-formats/INFORME_FINAL_ANGEL_MATEUS_HILEROS_055-2026.docx
+++ b/docs/final-formats/INFORME_FINAL_ANGEL_MATEUS_HILEROS_055-2026.docx
@@ -598,7 +598,7 @@
               <w:br/>
               <w:t>Producto / evidencia: Informes administrativos firmados de abril y mayo de 2026; registro base de reunión del 27 de marzo de 2026 (Google Meet, 49 minutos); trazabilidad de requerimientos funcionales y ajustes atendidos durante el periodo.</w:t>
               <w:br/>
-              <w:t>URL / acceso (página original): https://dev-palenke-two.vercel.app/docs ; informes ABRIL/MAYO 2026</w:t>
+              <w:t>URL / acceso (página original): https://pro-palenke-vw-two.vercel.app/docs ; informes ABRIL/MAYO 2026</w:t>
               <w:br/>
               <w:t>Estado: En proceso | Avance: 100%</w:t>
             </w:r>
@@ -635,9 +635,9 @@
               <w:t>Se diseñó, desarrolló y desplegó el MVP de la plataforma con Next.js, React, TypeScript y Tailwind. El alcance funcional entregado en Fase 1 incluye inicio, biblioteca, memoria afroterritorial, MJN, gobierno propio, incidencia, mirador de datos (Power BI) y paneles administrativos base. El geoportal/geovisor interno no se incluye como entregable cerrado del MVP; corresponde a la siguiente etapa.</w:t>
               <w:br/>
               <w:br/>
-              <w:t>Producto / evidencia: MVP funcional. Catálogo de módulos/URLs: https://dev-palenke-two.vercel.app/docs/modulos-y-urls. Docs generales: https://dev-palenke-two.vercel.app/docs.</w:t>
-              <w:br/>
-              <w:t>URL / acceso (página original): https://dev-palenke-two.vercel.app/ ; https://dev-palenke-two.vercel.app/docs/modulos-y-urls ; https://dev-palenke-two.vercel.app/docs</w:t>
+              <w:t>Producto / evidencia: MVP funcional. Catálogo de módulos/URLs: https://pro-palenke-vw-two.vercel.app/docs/modulos-y-urls. Docs generales: https://pro-palenke-vw-two.vercel.app/docs.</w:t>
+              <w:br/>
+              <w:t>URL / acceso (página original): https://pro-palenke-vw-two.vercel.app/ ; https://pro-palenke-vw-two.vercel.app/docs/modulos-y-urls ; https://pro-palenke-vw-two.vercel.app/docs</w:t>
               <w:br/>
               <w:t>Estado: Cumplido | Avance: 100%</w:t>
             </w:r>
@@ -674,9 +674,9 @@
               <w:t>Se implementó autenticación con Supabase SSR, validación de sesión, control de permisos por rol y flujos de solicitud/aprobación de acceso. También se habilitaron superficies diferenciadas para visitante público, usuario interno y administración.</w:t>
               <w:br/>
               <w:br/>
-              <w:t>Producto / evidencia: Sistema de usuarios y roles operativo. Guía legible: https://dev-palenke-two.vercel.app/docs/accesos. Login https://dev-palenke-two.vercel.app/login. Admin angelarrieta34@gmail.com / welcome123. Interno fconu@renacientes.org / @welcome123. Panel https://dev-palenke-two.vercel.app/admin.</w:t>
-              <w:br/>
-              <w:t>URL / acceso (página original): https://dev-palenke-two.vercel.app/docs/accesos ; https://dev-palenke-two.vercel.app/login ; https://dev-palenke-two.vercel.app/admin</w:t>
+              <w:t>Producto / evidencia: Sistema de usuarios y roles operativo. Guía legible: https://pro-palenke-vw-two.vercel.app/docs/accesos. Login https://pro-palenke-vw-two.vercel.app/login. Admin angelarrieta34@gmail.com / welcome123. Interno fconu@renacientes.org / @welcome123. Panel https://pro-palenke-vw-two.vercel.app/admin.</w:t>
+              <w:br/>
+              <w:t>URL / acceso (página original): https://pro-palenke-vw-two.vercel.app/docs/accesos ; https://pro-palenke-vw-two.vercel.app/login ; https://pro-palenke-vw-two.vercel.app/admin</w:t>
               <w:br/>
               <w:t>Estado: Cumplido | Avance: 100%</w:t>
             </w:r>
@@ -715,7 +715,7 @@
               <w:br/>
               <w:t>Producto / evidencia: Lógica de visibilidad y permisos activa para documentos, vistas protegidas y recursos con acceso condicionado por rol o por aprobación previa.</w:t>
               <w:br/>
-              <w:t>URL / acceso (página original): https://dev-palenke-two.vercel.app/docs/modulos-y-urls ; https://dev-palenke-two.vercel.app/gobierno-propio ; https://dev-palenke-two.vercel.app/biblioteca ; https://dev-palenke-two.vercel.app/memoria-afroterritorial</w:t>
+              <w:t>URL / acceso (página original): https://pro-palenke-vw-two.vercel.app/docs/modulos-y-urls ; https://pro-palenke-vw-two.vercel.app/gobierno-propio ; https://pro-palenke-vw-two.vercel.app/biblioteca ; https://pro-palenke-vw-two.vercel.app/memoria-afroterritorial</w:t>
               <w:br/>
               <w:t>Estado: Cumplido | Avance: 100%</w:t>
             </w:r>
@@ -754,7 +754,7 @@
               <w:br/>
               <w:t>Producto / evidencia: Biblioteca Base navegable y filtrable, con búsqueda funcional, resumen de filtros y acceso al corpus documental del MVP.</w:t>
               <w:br/>
-              <w:t>URL / acceso (página original): https://dev-palenke-two.vercel.app/docs/modulos-y-urls ; https://dev-palenke-two.vercel.app/biblioteca ; https://dev-palenke-two.vercel.app/memoria-afroterritorial ; https://dev-palenke-two.vercel.app/memoria-afroterritorial/mediateca-ubuntu</w:t>
+              <w:t>URL / acceso (página original): https://pro-palenke-vw-two.vercel.app/docs/modulos-y-urls ; https://pro-palenke-vw-two.vercel.app/biblioteca ; https://pro-palenke-vw-two.vercel.app/memoria-afroterritorial ; https://pro-palenke-vw-two.vercel.app/memoria-afroterritorial/mediateca-ubuntu</w:t>
               <w:br/>
               <w:t>Estado: Cumplido | Avance: 100%</w:t>
             </w:r>
@@ -793,7 +793,7 @@
               <w:br/>
               <w:t>Producto / evidencia: Sección MJN publicada con estructura editorial, tabs de contenido, piezas autorizadas y campañas visibles; pendiente completar insumos definitivos en algunos contenidos asociados a litigio.</w:t>
               <w:br/>
-              <w:t>URL / acceso (página original): https://dev-palenke-two.vercel.app/docs/modulos-y-urls ; https://dev-palenke-two.vercel.app/mujeres-juventudes-ninez</w:t>
+              <w:t>URL / acceso (página original): https://pro-palenke-vw-two.vercel.app/docs/modulos-y-urls ; https://pro-palenke-vw-two.vercel.app/mujeres-juventudes-ninez</w:t>
               <w:br/>
               <w:t>Estado: En proceso | Avance: 90%</w:t>
             </w:r>
@@ -832,7 +832,7 @@
               <w:br/>
               <w:t>Producto / evidencia: Power BI / mirador de datos: implementado (catálogo, SCITA/estadísticas, administración de tableros). Geoportal interno: NO implementado como módulo del MVP; diferido a la siguiente etapa. Evidencia de la página de acceso preparatoria en (no constituye cierre del módulo SIG).</w:t>
               <w:br/>
-              <w:t>URL / acceso (página original): https://dev-palenke-two.vercel.app/docs/modulos-y-urls ; https://dev-palenke-two.vercel.app/estadisticas ; https://dev-palenke-two.vercel.app/scita ; https://dev-palenke-two.vercel.app/admin/dashboards ; Geoportal siguiente etapa: https://dev-palenke-two.vercel.app/geoportal</w:t>
+              <w:t>URL / acceso (página original): https://pro-palenke-vw-two.vercel.app/docs/modulos-y-urls ; https://pro-palenke-vw-two.vercel.app/estadisticas ; https://pro-palenke-vw-two.vercel.app/scita ; https://pro-palenke-vw-two.vercel.app/admin/dashboards ; Geoportal siguiente etapa: https://pro-palenke-vw-two.vercel.app/geoportal</w:t>
               <w:br/>
               <w:t>Estado: En proceso | Avance: 70%</w:t>
             </w:r>
@@ -869,9 +869,9 @@
               <w:t>Se aseguró el acceso HTTPS en despliegue y se implementaron validaciones de sesión, protección de rutas, control de permisos y separación de vistas según rol. La protección cubre páginas internas y superficies administrativas.</w:t>
               <w:br/>
               <w:br/>
-              <w:t>Producto / evidencia: Seguridad básica operativa (HTTPS + sesión/roles). Entrada admin/interno vía https://dev-palenke-two.vercel.app/login ; credenciales admin e internas en https://dev-palenke-two.vercel.app/docs/accesos</w:t>
-              <w:br/>
-              <w:t>URL / acceso (página original): https://dev-palenke-two.vercel.app/docs/accesos ; https://dev-palenke-two.vercel.app/login ; https://dev-palenke-two.vercel.app/admin</w:t>
+              <w:t>Producto / evidencia: Seguridad básica operativa (HTTPS + sesión/roles). Entrada admin/interno vía https://pro-palenke-vw-two.vercel.app/login ; credenciales admin e internas en https://pro-palenke-vw-two.vercel.app/docs/accesos</w:t>
+              <w:br/>
+              <w:t>URL / acceso (página original): https://pro-palenke-vw-two.vercel.app/docs/accesos ; https://pro-palenke-vw-two.vercel.app/login ; https://pro-palenke-vw-two.vercel.app/admin</w:t>
               <w:br/>
               <w:t>Estado: Cumplido | Avance: 100%</w:t>
             </w:r>
@@ -908,9 +908,9 @@
               <w:t>El código fuente permanece versionado en GitHub con historial de cambios y despliegues continuos. Repositorio privado: https://github.com/anuidev8/palenke. Existen superficies administrativas funcionales en la plataforma. La entrega formal de accesos (GitHub por email + credenciales admin + acta) pertenece al cierre contractual.</w:t>
               <w:br/>
               <w:br/>
-              <w:t>Producto / evidencia: Código en GitHub privado + guía https://dev-palenke-two.vercel.app/docs/repositorio-codigo. Accesos plataforma: https://dev-palenke-two.vercel.app/docs/accesos. Pendiente acta formal de transferencia.</w:t>
-              <w:br/>
-              <w:t>URL / acceso (página original): https://dev-palenke-two.vercel.app/docs/repositorio-codigo ; https://github.com/anuidev8/palenke (privado; invitar por email) ; https://dev-palenke-two.vercel.app/docs/accesos</w:t>
+              <w:t>Producto / evidencia: Código en GitHub privado + guía https://pro-palenke-vw-two.vercel.app/docs/repositorio-codigo. Accesos plataforma: https://pro-palenke-vw-two.vercel.app/docs/accesos. Pendiente acta formal de transferencia.</w:t>
+              <w:br/>
+              <w:t>URL / acceso (página original): https://pro-palenke-vw-two.vercel.app/docs/repositorio-codigo ; https://github.com/anuidev8/palenke (privado; invitar por email) ; https://pro-palenke-vw-two.vercel.app/docs/accesos</w:t>
               <w:br/>
               <w:t>Estado: En proceso | Avance: 60%</w:t>
             </w:r>
@@ -947,9 +947,9 @@
               <w:t>Se elaboró documentación técnica del MVP en formatos Markdown, HTML y PDF, junto con el protocolo operativo de integración SIG - BI - PostgreSQL - Power BI - Palenke.</w:t>
               <w:br/>
               <w:br/>
-              <w:t>Producto / evidencia: Documentación técnica legible en https://dev-palenke-two.vercel.app/docs (arquitectura/DB: https://dev-palenke-two.vercel.app/docs/arquitectura-y-base-de-datos; construcción por módulo: https://dev-palenke-two.vercel.app/docs/como-esta-construido) y paquete docs/technical en el repositorio.</w:t>
-              <w:br/>
-              <w:t>URL / acceso (página original): https://dev-palenke-two.vercel.app/docs ; https://dev-palenke-two.vercel.app/docs/arquitectura-y-base-de-datos ; https://dev-palenke-two.vercel.app/docs/como-esta-construido ; docs/technical/palenke-mvp-technical-documentation.md</w:t>
+              <w:t>Producto / evidencia: Documentación técnica legible en https://pro-palenke-vw-two.vercel.app/docs (arquitectura/DB: https://pro-palenke-vw-two.vercel.app/docs/arquitectura-y-base-de-datos; construcción por módulo: https://pro-palenke-vw-two.vercel.app/docs/como-esta-construido) y paquete docs/technical en el repositorio.</w:t>
+              <w:br/>
+              <w:t>URL / acceso (página original): https://pro-palenke-vw-two.vercel.app/docs ; https://pro-palenke-vw-two.vercel.app/docs/arquitectura-y-base-de-datos ; https://pro-palenke-vw-two.vercel.app/docs/como-esta-construido ; docs/technical/palenke-mvp-technical-documentation.md</w:t>
               <w:br/>
               <w:t>Estado: Cumplido | Avance: 100%</w:t>
             </w:r>
@@ -988,7 +988,7 @@
               <w:br/>
               <w:t>Producto / evidencia: Sin evidencia formal de capacitación al equipo designado dentro del corte revisado.</w:t>
               <w:br/>
-              <w:t>URL / acceso (página original): https://dev-palenke-two.vercel.app/docs</w:t>
+              <w:t>URL / acceso (página original): https://pro-palenke-vw-two.vercel.app/docs</w:t>
               <w:br/>
               <w:t>Estado: No iniciado | Avance: 0%</w:t>
             </w:r>
@@ -1027,7 +1027,7 @@
               <w:br/>
               <w:t>Producto / evidencia: Historial de mejoras y correcciones en curso, soportado por cambios en el repositorio y por la trazabilidad consignada en informes mensuales.</w:t>
               <w:br/>
-              <w:t>URL / acceso (página original): https://dev-palenke-two.vercel.app/docs/modulos-y-urls ; https://dev-palenke-two.vercel.app/ ; https://github.com/anuidev8/palenke</w:t>
+              <w:t>URL / acceso (página original): https://pro-palenke-vw-two.vercel.app/docs/modulos-y-urls ; https://pro-palenke-vw-two.vercel.app/ ; https://github.com/anuidev8/palenke</w:t>
               <w:br/>
               <w:t>Estado: En proceso | Avance: 50%</w:t>
             </w:r>
@@ -1066,7 +1066,7 @@
               <w:br/>
               <w:t>Producto / evidencia: Taxonomías y metadatos parciales implementados en varios componentes del sistema, reutilizables para la fase integral.</w:t>
               <w:br/>
-              <w:t>URL / acceso (página original): https://dev-palenke-two.vercel.app/docs/arquitectura-y-base-de-datos ; https://dev-palenke-two.vercel.app/gobierno-propio ; https://dev-palenke-two.vercel.app/biblioteca</w:t>
+              <w:t>URL / acceso (página original): https://pro-palenke-vw-two.vercel.app/docs/arquitectura-y-base-de-datos ; https://pro-palenke-vw-two.vercel.app/gobierno-propio ; https://pro-palenke-vw-two.vercel.app/biblioteca</w:t>
               <w:br/>
               <w:t>Estado: En proceso | Avance: 55%</w:t>
             </w:r>
@@ -1105,7 +1105,7 @@
               <w:br/>
               <w:t>Producto / evidencia: Capacidades de búsqueda avanzada parciales: filtros múltiples en biblioteca, búsqueda por módulo, búsqueda jurídica y panel de búsqueda asistida.</w:t>
               <w:br/>
-              <w:t>URL / acceso (página original): https://dev-palenke-two.vercel.app/docs/modulos-y-urls ; https://dev-palenke-two.vercel.app/biblioteca</w:t>
+              <w:t>URL / acceso (página original): https://pro-palenke-vw-two.vercel.app/docs/modulos-y-urls ; https://pro-palenke-vw-two.vercel.app/biblioteca</w:t>
               <w:br/>
               <w:t>Estado: En proceso | Avance: 60%</w:t>
             </w:r>
@@ -1144,7 +1144,7 @@
               <w:br/>
               <w:t>Producto / evidencia: Módulo ACC funcional para gestión y visualización, con estructura pública y administrativa disponible.</w:t>
               <w:br/>
-              <w:t>URL / acceso (página original): https://dev-palenke-two.vercel.app/docs/modulos-y-urls ; https://dev-palenke-two.vercel.app/gobierno-propio ; https://dev-palenke-two.vercel.app/admin/accs ; https://dev-palenke-two.vercel.app/docs/accesos</w:t>
+              <w:t>URL / acceso (página original): https://pro-palenke-vw-two.vercel.app/docs/modulos-y-urls ; https://pro-palenke-vw-two.vercel.app/gobierno-propio ; https://pro-palenke-vw-two.vercel.app/admin/accs ; https://pro-palenke-vw-two.vercel.app/docs/accesos</w:t>
               <w:br/>
               <w:t>Estado: En proceso | Avance: 90%</w:t>
             </w:r>
@@ -1183,7 +1183,7 @@
               <w:br/>
               <w:t>Producto / evidencia: Módulo de incidencia publicado y utilizable; componente de litigio estratégico aún en consolidación.</w:t>
               <w:br/>
-              <w:t>URL / acceso (página original): https://dev-palenke-two.vercel.app/docs/modulos-y-urls ; https://dev-palenke-two.vercel.app/incidencia ; https://dev-palenke-two.vercel.app/noticias</w:t>
+              <w:t>URL / acceso (página original): https://pro-palenke-vw-two.vercel.app/docs/modulos-y-urls ; https://pro-palenke-vw-two.vercel.app/incidencia ; https://pro-palenke-vw-two.vercel.app/noticias</w:t>
               <w:br/>
               <w:t>Estado: En proceso | Avance: 55%</w:t>
             </w:r>
@@ -1222,7 +1222,7 @@
               <w:br/>
               <w:t>Producto / evidencia: Conjunto de endpoints internos implementados para soporte funcional del portal, administración de acceso y gestión documental.</w:t>
               <w:br/>
-              <w:t>URL / acceso (página original): https://dev-palenke-two.vercel.app/docs/arquitectura-y-base-de-datos ; https://dev-palenke-two.vercel.app/docs ; https://dev-palenke-two.vercel.app/</w:t>
+              <w:t>URL / acceso (página original): https://pro-palenke-vw-two.vercel.app/docs/arquitectura-y-base-de-datos ; https://pro-palenke-vw-two.vercel.app/docs ; https://pro-palenke-vw-two.vercel.app/</w:t>
               <w:br/>
               <w:t>Estado: En proceso | Avance: 60%</w:t>
             </w:r>
@@ -1261,7 +1261,7 @@
               <w:br/>
               <w:t>Producto / evidencia: Sin evidencia formal de optimización ampliada o auditoría específica de performance/seguridad.</w:t>
               <w:br/>
-              <w:t>URL / acceso (página original): https://dev-palenke-two.vercel.app/docs</w:t>
+              <w:t>URL / acceso (página original): https://pro-palenke-vw-two.vercel.app/docs</w:t>
               <w:br/>
               <w:t>Estado: No iniciado | Avance: 0%</w:t>
             </w:r>
@@ -1300,7 +1300,7 @@
               <w:br/>
               <w:t>Producto / evidencia: Base documental ampliada en construcción: protocolo técnico, checklist de cumplimiento y materiales de continuidad.</w:t>
               <w:br/>
-              <w:t>URL / acceso (página original): https://dev-palenke-two.vercel.app/docs ; https://dev-palenke-two.vercel.app/docs/arquitectura-y-base-de-datos ; https://dev-palenke-two.vercel.app/docs/como-esta-construido</w:t>
+              <w:t>URL / acceso (página original): https://pro-palenke-vw-two.vercel.app/docs ; https://pro-palenke-vw-two.vercel.app/docs/arquitectura-y-base-de-datos ; https://pro-palenke-vw-two.vercel.app/docs/como-esta-construido</w:t>
               <w:br/>
               <w:t>Estado: En proceso | Avance: 60%</w:t>
             </w:r>
@@ -1339,7 +1339,7 @@
               <w:br/>
               <w:t>Producto / evidencia: Sin evidencia formal de capacitación complementaria.</w:t>
               <w:br/>
-              <w:t>URL / acceso (página original): https://dev-palenke-two.vercel.app/docs</w:t>
+              <w:t>URL / acceso (página original): https://pro-palenke-vw-two.vercel.app/docs</w:t>
               <w:br/>
               <w:t>Estado: No iniciado | Avance: 0%</w:t>
             </w:r>
@@ -1378,7 +1378,7 @@
               <w:br/>
               <w:t>Producto / evidencia: Historial de continuidad técnica y mantenimiento funcional del portal durante el periodo evaluado.</w:t>
               <w:br/>
-              <w:t>URL / acceso (página original): https://dev-palenke-two.vercel.app/docs/modulos-y-urls ; https://dev-palenke-two.vercel.app/ ; https://dev-palenke-two.vercel.app/docs/repositorio-codigo</w:t>
+              <w:t>URL / acceso (página original): https://pro-palenke-vw-two.vercel.app/docs/modulos-y-urls ; https://pro-palenke-vw-two.vercel.app/ ; https://pro-palenke-vw-two.vercel.app/docs/repositorio-codigo</w:t>
               <w:br/>
               <w:t>Estado: En proceso | Avance: 60%</w:t>
             </w:r>
@@ -1411,21 +1411,21 @@
         <w:br/>
         <w:t>2. Documentación / evidencias legibles (Fumadocs en la plataforma):</w:t>
         <w:br/>
-        <w:t xml:space="preserve">   https://dev-palenke-two.vercel.app/docs</w:t>
+        <w:t xml:space="preserve">   https://pro-palenke-vw-two.vercel.app/docs</w:t>
         <w:br/>
-        <w:t xml:space="preserve">   https://dev-palenke-two.vercel.app/docs/informe-y-matriz</w:t>
+        <w:t xml:space="preserve">   https://pro-palenke-vw-two.vercel.app/docs/informe-y-matriz</w:t>
         <w:br/>
-        <w:t xml:space="preserve">   https://dev-palenke-two.vercel.app/docs/accesos</w:t>
+        <w:t xml:space="preserve">   https://pro-palenke-vw-two.vercel.app/docs/accesos</w:t>
         <w:br/>
-        <w:t xml:space="preserve">   https://dev-palenke-two.vercel.app/docs/modulos-y-urls</w:t>
+        <w:t xml:space="preserve">   https://pro-palenke-vw-two.vercel.app/docs/modulos-y-urls</w:t>
         <w:br/>
-        <w:t xml:space="preserve">   https://dev-palenke-two.vercel.app/docs/arquitectura-y-base-de-datos</w:t>
+        <w:t xml:space="preserve">   https://pro-palenke-vw-two.vercel.app/docs/arquitectura-y-base-de-datos</w:t>
         <w:br/>
-        <w:t xml:space="preserve">   https://dev-palenke-two.vercel.app/docs/como-esta-construido</w:t>
+        <w:t xml:space="preserve">   https://pro-palenke-vw-two.vercel.app/docs/como-esta-construido</w:t>
         <w:br/>
-        <w:t xml:space="preserve">   https://dev-palenke-two.vercel.app/docs/repositorio-codigo</w:t>
+        <w:t xml:space="preserve">   https://pro-palenke-vw-two.vercel.app/docs/repositorio-codigo</w:t>
         <w:br/>
-        <w:t>3. URL producto MVP: https://dev-palenke-two.vercel.app/</w:t>
+        <w:t>3. URL producto MVP: https://pro-palenke-vw-two.vercel.app/</w:t>
         <w:br/>
         <w:t>4. Repositorio código (privado): https://github.com/anuidev8/palenke (invitar por email; ver /docs/repositorio-codigo)</w:t>
         <w:br/>
@@ -1438,11 +1438,11 @@
         <w:br/>
         <w:t>ACCESOS A LA PLATAFORMA</w:t>
         <w:br/>
-        <w:t>Guía: https://dev-palenke-two.vercel.app/docs/accesos</w:t>
+        <w:t>Guía: https://pro-palenke-vw-two.vercel.app/docs/accesos</w:t>
         <w:br/>
-        <w:t>Login: https://dev-palenke-two.vercel.app/login</w:t>
+        <w:t>Login: https://pro-palenke-vw-two.vercel.app/login</w:t>
         <w:br/>
-        <w:t>Admin — angelarrieta34@gmail.com / welcome123 → https://dev-palenke-two.vercel.app/admin</w:t>
+        <w:t>Admin — angelarrieta34@gmail.com / welcome123 → https://pro-palenke-vw-two.vercel.app/admin</w:t>
         <w:br/>
         <w:t>Interno — fconu@renacientes.org / @welcome123 → login con rol internal.</w:t>
         <w:br/>
@@ -1456,7 +1456,7 @@
         <w:br/>
         <w:t>NOTA GEOPORTAL</w:t>
         <w:br/>
-        <w:t>Fuera del cierre MVP (siguiente etapa). Acceso preparatorio: https://dev-palenke-two.vercel.app/geoportal — ver /docs/modulos-y-urls.</w:t>
+        <w:t>Fuera del cierre MVP (siguiente etapa). Acceso preparatorio: https://pro-palenke-vw-two.vercel.app/geoportal — ver /docs/modulos-y-urls.</w:t>
         <w:br/>
         <w:br/>
         <w:t>PENDIENTES</w:t>

</xml_diff>